<commit_message>
Two-login model: Manager + Agent (Inside Sales/CX/Ops types, all tools for all agents); summary repitched around better-not-cheaper
</commit_message>
<xml_diff>
--- a/docs/VentureDial-Summary.docx
+++ b/docs/VentureDial-Summary.docx
@@ -62,17 +62,7 @@
         <w:spacing w:after="120"/>
       </w:pPr>
       <w:r>
-        <w:t xml:space="preserve">Our inside sales team of 25 remote agents runs on Five9 today. It is expensive (typically </w:t>
-      </w:r>
-      <w:r>
-        <w:rPr>
-          <w:b/>
-          <w:bCs/>
-        </w:rPr>
-        <w:t xml:space="preserve">$3,000–$8,000+ per month</w:t>
-      </w:r>
-      <w:r>
-        <w:t xml:space="preserve"> at our seat count once AI add-ons are included), the agent experience is dated, and it does little to actively improve our two most important numbers: </w:t>
+        <w:t xml:space="preserve">Our inside sales team of 25 remote agents runs on Five9 today. It is a passive tool: it places calls, but it does nothing to actively improve our two most important numbers — </w:t>
       </w:r>
       <w:r>
         <w:rPr>
@@ -92,7 +82,7 @@
         <w:t xml:space="preserve">appointments booked per agent</w:t>
       </w:r>
       <w:r>
-        <w:t xml:space="preserve">.</w:t>
+        <w:t xml:space="preserve">. The agent experience is dated, and AI sits in dashboards instead of in the conversation.</w:t>
       </w:r>
     </w:p>
     <w:p>
@@ -100,43 +90,73 @@
         <w:spacing w:after="120"/>
       </w:pPr>
       <w:r>
-        <w:t xml:space="preserve">We researched the leading platforms — Five9, Convoso, Orum, Nooks, Salesfinity, Kixie, PhoneBurner, JustCall, Aircall, and Dialpad — cataloguing what users love and what they complain about. The conclusion: no vendor combines modern agent experience, reliability, contact-rate science, and AI coaching in one product. Because telephony itself is now a commodity API (Twilio), we can build that combination ourselves, tailored to solar appointment-setting, for roughly </w:t>
+        <w:t xml:space="preserve">We researched 22+ platforms — Five9, Convoso, Orum, Nooks, Salesfinity, Kixie, PhoneBurner, JustCall, Aircall, Dialpad, NICE, Genesys, Talkdesk and more — cataloguing what users love and what they complain about. The conclusion: </w:t>
       </w:r>
       <w:r>
         <w:rPr>
           <w:b/>
           <w:bCs/>
         </w:rPr>
-        <w:t xml:space="preserve">$2,000–$3,700/month</w:t>
-      </w:r>
-      <w:r>
-        <w:t xml:space="preserve"> in running costs — and own the roadmap.</w:t>
-      </w:r>
-    </w:p>
-    <w:p>
-      <w:pPr>
-        <w:pStyle w:val="Heading1"/>
-      </w:pPr>
-      <w:r>
-        <w:t xml:space="preserve">What VentureDial does</w:t>
-      </w:r>
-    </w:p>
-    <w:p>
-      <w:pPr>
-        <w:spacing w:after="120"/>
-      </w:pPr>
-      <w:r>
-        <w:t xml:space="preserve">One platform, four workspaces — </w:t>
+        <w:t xml:space="preserve">no vendor combines modern agent experience, reliability, contact-rate science, and AI coaching in one product.</w:t>
+      </w:r>
+      <w:r>
+        <w:t xml:space="preserve"> Because telephony itself is now a commodity API, we can build that combination ourselves, tailored to solar appointment-setting, deeply integrated with our own CRM — and own the roadmap. This is about building something </w:t>
       </w:r>
       <w:r>
         <w:rPr>
           <w:b/>
           <w:bCs/>
         </w:rPr>
-        <w:t xml:space="preserve">Agent, Manager, Customer Experience (CX), and Operations</w:t>
-      </w:r>
-      <w:r>
-        <w:t xml:space="preserve">. A working interactive prototype of every feature below exists today.</w:t>
+        <w:t xml:space="preserve">better</w:t>
+      </w:r>
+      <w:r>
+        <w:t xml:space="preserve"> than anything we can buy; the fact that it also costs less to run is a bonus, not the point.</w:t>
+      </w:r>
+    </w:p>
+    <w:p>
+      <w:pPr>
+        <w:pStyle w:val="Heading1"/>
+      </w:pPr>
+      <w:r>
+        <w:t xml:space="preserve">What VentureDial does</w:t>
+      </w:r>
+    </w:p>
+    <w:p>
+      <w:pPr>
+        <w:spacing w:after="120"/>
+      </w:pPr>
+      <w:r>
+        <w:t xml:space="preserve">One platform, two logins — </w:t>
+      </w:r>
+      <w:r>
+        <w:rPr>
+          <w:b/>
+          <w:bCs/>
+        </w:rPr>
+        <w:t xml:space="preserve">Agent</w:t>
+      </w:r>
+      <w:r>
+        <w:t xml:space="preserve"> and </w:t>
+      </w:r>
+      <w:r>
+        <w:rPr>
+          <w:b/>
+          <w:bCs/>
+        </w:rPr>
+        <w:t xml:space="preserve">Manager</w:t>
+      </w:r>
+      <w:r>
+        <w:t xml:space="preserve">. Agents come in three types — </w:t>
+      </w:r>
+      <w:r>
+        <w:rPr>
+          <w:b/>
+          <w:bCs/>
+        </w:rPr>
+        <w:t xml:space="preserve">Inside Sales, Customer Experience (CX), and Operations</w:t>
+      </w:r>
+      <w:r>
+        <w:t xml:space="preserve"> — and every agent gets every tool: an Inside Sales agent can work the CX inbox, an Ops agent can dial. Inbound ring groups route calls to the right team automatically. A working interactive prototype of every feature below exists today.</w:t>
       </w:r>
     </w:p>
     <w:p>
@@ -320,7 +340,7 @@
         <w:pStyle w:val="Heading2"/>
       </w:pPr>
       <w:r>
-        <w:t xml:space="preserve">For CX and Operations</w:t>
+        <w:t xml:space="preserve">CX &amp; Operations tools (inside every agent workspace)</w:t>
       </w:r>
     </w:p>
     <w:p>
@@ -337,10 +357,10 @@
           <w:b/>
           <w:bCs/>
         </w:rPr>
-        <w:t xml:space="preserve">CX: </w:t>
-      </w:r>
-      <w:r>
-        <w:t xml:space="preserve">a unified inbox of every customer call and text, with install stage and ticket context on screen before answering.</w:t>
+        <w:t xml:space="preserve">CX inbox: </w:t>
+      </w:r>
+      <w:r>
+        <w:t xml:space="preserve">a unified view of every customer call and text, with install stage and ticket context on screen before answering.</w:t>
       </w:r>
     </w:p>
     <w:p>
@@ -357,10 +377,10 @@
           <w:b/>
           <w:bCs/>
         </w:rPr>
-        <w:t xml:space="preserve">Ops: </w:t>
-      </w:r>
-      <w:r>
-        <w:t xml:space="preserve">inbound ring groups routed by team and identified by source (callers from Google Ads vs. Facebook are tagged before pickup), lead-source performance analytics, per-user-type disposition sets, and an AI Script Lab that proposes script improvements from real call outcomes and A/B tests them.</w:t>
+        <w:t xml:space="preserve">Ops tools: </w:t>
+      </w:r>
+      <w:r>
+        <w:t xml:space="preserve">inbound ring groups routed by team and identified by source (callers from Google Ads vs. Facebook are tagged before pickup), lead-source performance analytics, per-agent-type disposition sets, one-click number registration with branded caller ID, and an AI Script Lab that proposes script improvements from real call outcomes and A/B tests them — continuously self-improving.</w:t>
       </w:r>
     </w:p>
     <w:p>
@@ -1064,7 +1084,15 @@
         <w:pStyle w:val="Heading1"/>
       </w:pPr>
       <w:r>
-        <w:t xml:space="preserve">Cost</w:t>
+        <w:t xml:space="preserve">Operating cost</w:t>
+      </w:r>
+    </w:p>
+    <w:p>
+      <w:pPr>
+        <w:spacing w:after="120"/>
+      </w:pPr>
+      <w:r>
+        <w:t xml:space="preserve">Running costs are usage-based and scale with the team — no per-seat licenses, no add-on sprawl, no surprise renewals.</w:t>
       </w:r>
     </w:p>
     <w:tbl>
@@ -1488,7 +1516,7 @@
                 <w:sz w:val="20"/>
                 <w:szCs w:val="20"/>
               </w:rPr>
-              <w:t xml:space="preserve">~$2,000–$3,700  (vs. $3,000–$8,000+ for 25 vendor seats)</w:t>
+              <w:t xml:space="preserve">~$2,000–$3,700</w:t>
             </w:r>
           </w:p>
         </w:tc>
@@ -2104,17 +2132,7 @@
         <w:spacing w:after="120"/>
       </w:pPr>
       <w:r>
-        <w:t xml:space="preserve">We pilot against Five9 from week 4 with weekly connect-rate and appointment comparisons — a decision gate at week 6, not a leap of faith. Payback on the build is roughly </w:t>
-      </w:r>
-      <w:r>
-        <w:rPr>
-          <w:b/>
-          <w:bCs/>
-        </w:rPr>
-        <w:t xml:space="preserve">6–12 months</w:t>
-      </w:r>
-      <w:r>
-        <w:t xml:space="preserve">, after which we own a platform tuned to solar that also feeds our payroll-verification agent with call-activity data automatically.</w:t>
+        <w:t xml:space="preserve">We pilot against Five9 from week 4 with weekly connect-rate and appointment comparisons — a decision gate at week 6, not a leap of faith. The prize is capability nobody sells: AI in every call, scripts that improve themselves from outcomes, deep integration with our own CRM and payroll systems, and a roadmap we control. The lower running cost simply makes the decision easier.</w:t>
       </w:r>
     </w:p>
     <w:p>

</xml_diff>

<commit_message>
Canopy CRM integration noted (Salesforce phase-out); team size updated to 50+ agents
</commit_message>
<xml_diff>
--- a/docs/VentureDial-Summary.docx
+++ b/docs/VentureDial-Summary.docx
@@ -62,27 +62,37 @@
         <w:spacing w:after="120"/>
       </w:pPr>
       <w:r>
-        <w:t xml:space="preserve">Our inside sales team of 25 remote agents runs on Five9 today. It is a passive tool: it places calls, but it does nothing to actively improve our two most important numbers — </w:t>
+        <w:t xml:space="preserve">Our remote team is now </w:t>
       </w:r>
       <w:r>
         <w:rPr>
           <w:b/>
           <w:bCs/>
         </w:rPr>
-        <w:t xml:space="preserve">contact rate</w:t>
-      </w:r>
-      <w:r>
-        <w:t xml:space="preserve"> and </w:t>
+        <w:t xml:space="preserve">50+ agents</w:t>
+      </w:r>
+      <w:r>
+        <w:t xml:space="preserve"> across Inside Sales, Customer Experience, and Operations, with the sales side running on Five9 today. Five9 is a passive tool: it places calls, but it does nothing to actively improve our two most important numbers — </w:t>
       </w:r>
       <w:r>
         <w:rPr>
           <w:b/>
           <w:bCs/>
         </w:rPr>
+        <w:t xml:space="preserve">contact rate</w:t>
+      </w:r>
+      <w:r>
+        <w:t xml:space="preserve"> and </w:t>
+      </w:r>
+      <w:r>
+        <w:rPr>
+          <w:b/>
+          <w:bCs/>
+        </w:rPr>
         <w:t xml:space="preserve">appointments booked per agent</w:t>
       </w:r>
       <w:r>
-        <w:t xml:space="preserve">. The agent experience is dated, and AI sits in dashboards instead of in the conversation.</w:t>
+        <w:t xml:space="preserve">. The agent experience is dated, AI sits in dashboards instead of in the conversation, and CX and Ops work in separate tools entirely.</w:t>
       </w:r>
     </w:p>
     <w:p>
@@ -272,7 +282,7 @@
         <w:t xml:space="preserve">Live salesfloor: </w:t>
       </w:r>
       <w:r>
-        <w:t xml:space="preserve">real-time status of all 25 agents; automatic alerts (Google Chat) when anyone is inactive 15+ minutes.</w:t>
+        <w:t xml:space="preserve">real-time status of all 50+ agents in one view; automatic alerts (Google Chat) when anyone is inactive 15+ minutes.</w:t>
       </w:r>
     </w:p>
     <w:p>
@@ -1048,7 +1058,7 @@
         <w:pStyle w:val="Heading2"/>
       </w:pPr>
       <w:r>
-        <w:t xml:space="preserve">CRM flexibility — including our custom CRM</w:t>
+        <w:t xml:space="preserve">Built for Canopy CRM</w:t>
       </w:r>
     </w:p>
     <w:p>
@@ -1066,17 +1076,27 @@
         <w:t xml:space="preserve">CRM-agnostic by design</w:t>
       </w:r>
       <w:r>
-        <w:t xml:space="preserve">. All CRM traffic goes through one internal adapter interface (pull lead lists, write back activities and AI summaries, sync dispositions). Salesforce is simply the first adapter. </w:t>
+        <w:t xml:space="preserve">, and that design has a destination: </w:t>
       </w:r>
       <w:r>
         <w:rPr>
           <w:b/>
           <w:bCs/>
         </w:rPr>
-        <w:t xml:space="preserve">Our in-house CRM connects through the same interface</w:t>
-      </w:r>
-      <w:r>
-        <w:t xml:space="preserve"> — a REST API plus real-time webhooks for every event (call completed, appointment booked, SMS received, lead source flagged). When the custom CRM is ready, we point the adapter at it; the dialer itself does not change. This is a strong argument for building rather than buying: no vendor will integrate with our CRM as deeply as we can.</w:t>
+        <w:t xml:space="preserve">Canopy, the CRM we are building in-house</w:t>
+      </w:r>
+      <w:r>
+        <w:t xml:space="preserve">. All CRM traffic goes through one adapter interface (pull lead lists, write back activities and AI summaries, sync dispositions). Salesforce is the first adapter and serves us during the transition; </w:t>
+      </w:r>
+      <w:r>
+        <w:rPr>
+          <w:b/>
+          <w:bCs/>
+        </w:rPr>
+        <w:t xml:space="preserve">as Salesforce is phased out, Canopy connects through the same interface</w:t>
+      </w:r>
+      <w:r>
+        <w:t xml:space="preserve"> — a REST API plus real-time webhooks for every event (call completed, appointment booked, SMS received, lead source flagged) — and the dialer itself does not change. Dialer and CRM are being designed side by side, which means an integration depth no vendor pairing can match: one lead record, one timeline, one source of truth across calling, texting, and the customer journey.</w:t>
       </w:r>
     </w:p>
     <w:p>
@@ -1092,7 +1112,7 @@
         <w:spacing w:after="120"/>
       </w:pPr>
       <w:r>
-        <w:t xml:space="preserve">Running costs are usage-based and scale with the team — no per-seat licenses, no add-on sprawl, no surprise renewals.</w:t>
+        <w:t xml:space="preserve">Running costs are usage-based and scale with the team (sized below for 50+ agents) — no per-seat licenses, no add-on sprawl, no surprise renewals.</w:t>
       </w:r>
     </w:p>
     <w:tbl>
@@ -1198,7 +1218,7 @@
                 <w:sz w:val="20"/>
                 <w:szCs w:val="20"/>
               </w:rPr>
-              <w:t xml:space="preserve">Twilio voice (~150k min) + ~40 numbers</w:t>
+              <w:t xml:space="preserve">Twilio voice (~200k min) + ~50 numbers</w:t>
             </w:r>
           </w:p>
         </w:tc>
@@ -1226,7 +1246,7 @@
                 <w:sz w:val="20"/>
                 <w:szCs w:val="20"/>
               </w:rPr>
-              <w:t xml:space="preserve">$1,400–$2,400</w:t>
+              <w:t xml:space="preserve">$1,800–$3,000</w:t>
             </w:r>
           </w:p>
         </w:tc>
@@ -1284,7 +1304,7 @@
                 <w:sz w:val="20"/>
                 <w:szCs w:val="20"/>
               </w:rPr>
-              <w:t xml:space="preserve">$150–$250</w:t>
+              <w:t xml:space="preserve">$200–$350</w:t>
             </w:r>
           </w:p>
         </w:tc>
@@ -1342,7 +1362,7 @@
                 <w:sz w:val="20"/>
                 <w:szCs w:val="20"/>
               </w:rPr>
-              <w:t xml:space="preserve">$250–$500</w:t>
+              <w:t xml:space="preserve">$400–$800</w:t>
             </w:r>
           </w:p>
         </w:tc>
@@ -1458,7 +1478,7 @@
                 <w:sz w:val="20"/>
                 <w:szCs w:val="20"/>
               </w:rPr>
-              <w:t xml:space="preserve">$150–$300</w:t>
+              <w:t xml:space="preserve">$200–$400</w:t>
             </w:r>
           </w:p>
         </w:tc>
@@ -1516,7 +1536,7 @@
                 <w:sz w:val="20"/>
                 <w:szCs w:val="20"/>
               </w:rPr>
-              <w:t xml:space="preserve">~$2,000–$3,700</w:t>
+              <w:t xml:space="preserve">~$2,700–$4,900</w:t>
             </w:r>
           </w:p>
         </w:tc>

</xml_diff>